<commit_message>
Informe general: pantallas de la app y del panel (sección 5.5)
Co-Authored-By: Claude Opus 5.5 <noreply@anthropic.com>
Claude-Session: https://claude.ai/code/session_01Du2rFrgDj6BKfPt7pGeuwq
</commit_message>
<xml_diff>
--- a/docs/informes/Informe general - Nahualate y Kalo Campo.docx
+++ b/docs/informes/Informe general - Nahualate y Kalo Campo.docx
@@ -7809,6 +7809,1185 @@
           <w:szCs w:val="22"/>
         </w:rPr>
         <w:t xml:space="preserve">Se proponen dos caminos: (a) convivencia, con Kalo Campo para sanidad, riego y gerencia mientras Habacus sigue con labores; (b) reemplazo gradual de la toma de labores por Kalo Campo, conservando la integración con Evolution. Se recomienda decidir después del piloto, con datos de uso.</w:t>
+      </w:r>
+    </w:p>
+    <w:p>
+      <w:pPr>
+        <w:pStyle w:val="Heading2"/>
+        <w:keepNext/>
+        <w:pageBreakBefore/>
+        <w:spacing w:after="120" w:before="280"/>
+      </w:pPr>
+      <w:r>
+        <w:rPr>
+          <w:rFonts w:ascii="Archivo ExtraBold" w:cs="Archivo ExtraBold" w:eastAsia="Archivo ExtraBold" w:hAnsi="Archivo ExtraBold"/>
+          <w:color w:val="141311"/>
+          <w:sz w:val="24"/>
+          <w:szCs w:val="24"/>
+        </w:rPr>
+        <w:t xml:space="preserve">5.5 PANTALLAS DE LA APP (DEMO)</w:t>
+      </w:r>
+    </w:p>
+    <w:p>
+      <w:pPr>
+        <w:spacing w:after="140" w:line="300"/>
+      </w:pPr>
+      <w:r>
+        <w:rPr>
+          <w:rFonts w:ascii="Archivo" w:cs="Archivo" w:eastAsia="Archivo" w:hAnsi="Archivo"/>
+          <w:color w:val="3A3733"/>
+          <w:sz w:val="22"/>
+          <w:szCs w:val="22"/>
+        </w:rPr>
+        <w:t xml:space="preserve">Las siguientes pantallas son del demo de Kalo Campo con datos de prueba. Todas funcionan sin señal; arriba a la derecha está siempre el botón ENVIAR.</w:t>
+      </w:r>
+    </w:p>
+    <w:p>
+      <w:pPr>
+        <w:keepNext/>
+        <w:spacing w:after="80" w:before="200"/>
+      </w:pPr>
+      <w:r>
+        <w:rPr>
+          <w:rFonts w:ascii="Archivo SemiBold" w:cs="Archivo SemiBold" w:eastAsia="Archivo SemiBold" w:hAnsi="Archivo SemiBold"/>
+          <w:color w:val="141311"/>
+          <w:sz w:val="22"/>
+          <w:szCs w:val="22"/>
+        </w:rPr>
+        <w:t xml:space="preserve">Acceso y caporal</w:t>
+      </w:r>
+    </w:p>
+    <w:tbl>
+      <w:tblPr>
+        <w:tblW w:type="dxa" w:w="9360"/>
+        <w:tblBorders>
+          <w:top w:val="single" w:color="auto" w:sz="4"/>
+          <w:left w:val="single" w:color="auto" w:sz="4"/>
+          <w:bottom w:val="single" w:color="auto" w:sz="4"/>
+          <w:right w:val="single" w:color="auto" w:sz="4"/>
+          <w:insideH w:val="single" w:color="auto" w:sz="4"/>
+          <w:insideV w:val="single" w:color="auto" w:sz="4"/>
+        </w:tblBorders>
+      </w:tblPr>
+      <w:tblGrid>
+        <w:gridCol w:w="3120"/>
+        <w:gridCol w:w="3120"/>
+        <w:gridCol w:w="3120"/>
+      </w:tblGrid>
+      <w:tr>
+        <w:trPr>
+          <w:cantSplit/>
+        </w:trPr>
+        <w:tc>
+          <w:tcPr>
+            <w:tcW w:type="dxa" w:w="3120"/>
+            <w:tcBorders>
+              <w:top w:val="none" w:color="FFFFFF" w:sz="0"/>
+              <w:left w:val="none" w:color="FFFFFF" w:sz="0"/>
+              <w:bottom w:val="none" w:color="FFFFFF" w:sz="0"/>
+              <w:right w:val="none" w:color="FFFFFF" w:sz="0"/>
+            </w:tcBorders>
+            <w:tcMar>
+              <w:top w:type="dxa" w:w="60"/>
+              <w:left w:type="dxa" w:w="80"/>
+              <w:bottom w:type="dxa" w:w="60"/>
+              <w:right w:type="dxa" w:w="80"/>
+            </w:tcMar>
+          </w:tcPr>
+          <w:p>
+            <w:pPr>
+              <w:jc w:val="center"/>
+            </w:pPr>
+            <w:r>
+              <w:drawing>
+                <wp:inline distT="0" distB="0" distL="0" distR="0">
+                  <wp:extent cx="1428750" cy="3095625"/>
+                  <wp:effectExtent t="19050" r="19050" b="19050" l="19050"/>
+                  <wp:docPr id="1" name="" descr="" title=""/>
+                  <wp:cNvGraphicFramePr>
+                    <a:graphicFrameLocks xmlns:a="http://schemas.openxmlformats.org/drawingml/2006/main" noChangeAspect="1"/>
+                  </wp:cNvGraphicFramePr>
+                  <a:graphic xmlns:a="http://schemas.openxmlformats.org/drawingml/2006/main">
+                    <a:graphicData uri="http://schemas.openxmlformats.org/drawingml/2006/picture">
+                      <pic:pic xmlns:pic="http://schemas.openxmlformats.org/drawingml/2006/picture">
+                        <pic:nvPicPr>
+                          <pic:cNvPr id="0" name="" descr=""/>
+                          <pic:cNvPicPr>
+                            <a:picLocks noChangeAspect="1" noChangeArrowheads="1"/>
+                          </pic:cNvPicPr>
+                        </pic:nvPicPr>
+                        <pic:blipFill>
+                          <a:blip r:embed="rId12" cstate="none"/>
+                          <a:srcRect/>
+                          <a:stretch>
+                            <a:fillRect/>
+                          </a:stretch>
+                        </pic:blipFill>
+                        <pic:spPr bwMode="auto">
+                          <a:xfrm>
+                            <a:off x="0" y="0"/>
+                            <a:ext cx="1428750" cy="3095625"/>
+                          </a:xfrm>
+                          <a:prstGeom prst="rect">
+                            <a:avLst/>
+                          </a:prstGeom>
+                          <a:noFill/>
+                          <a:ln>
+                            <a:solidFill>
+                              <a:srgbClr val="E2DED7"/>
+                            </a:solidFill>
+                          </a:ln>
+                        </pic:spPr>
+                      </pic:pic>
+                    </a:graphicData>
+                  </a:graphic>
+                </wp:inline>
+              </w:drawing>
+            </w:r>
+          </w:p>
+          <w:p>
+            <w:pPr>
+              <w:spacing w:after="200" w:before="60" w:line="260"/>
+              <w:jc w:val="center"/>
+            </w:pPr>
+            <w:r>
+              <w:rPr>
+                <w:rFonts w:ascii="Archivo ExtraBold" w:cs="Archivo ExtraBold" w:eastAsia="Archivo ExtraBold" w:hAnsi="Archivo ExtraBold"/>
+                <w:color w:val="141311"/>
+                <w:spacing w:val="20"/>
+                <w:sz w:val="15"/>
+                <w:szCs w:val="15"/>
+              </w:rPr>
+              <w:t xml:space="preserve">FIGURA 1. </w:t>
+            </w:r>
+            <w:r>
+              <w:rPr>
+                <w:rFonts w:ascii="Archivo" w:cs="Archivo" w:eastAsia="Archivo" w:hAnsi="Archivo"/>
+                <w:color w:val="6F6A62"/>
+                <w:sz w:val="17"/>
+                <w:szCs w:val="17"/>
+              </w:rPr>
+              <w:t xml:space="preserve">Carga de la app con el logo.</w:t>
+            </w:r>
+          </w:p>
+        </w:tc>
+        <w:tc>
+          <w:tcPr>
+            <w:tcW w:type="dxa" w:w="3120"/>
+            <w:tcBorders>
+              <w:top w:val="none" w:color="FFFFFF" w:sz="0"/>
+              <w:left w:val="none" w:color="FFFFFF" w:sz="0"/>
+              <w:bottom w:val="none" w:color="FFFFFF" w:sz="0"/>
+              <w:right w:val="none" w:color="FFFFFF" w:sz="0"/>
+            </w:tcBorders>
+            <w:tcMar>
+              <w:top w:type="dxa" w:w="60"/>
+              <w:left w:type="dxa" w:w="80"/>
+              <w:bottom w:type="dxa" w:w="60"/>
+              <w:right w:type="dxa" w:w="80"/>
+            </w:tcMar>
+          </w:tcPr>
+          <w:p>
+            <w:pPr>
+              <w:jc w:val="center"/>
+            </w:pPr>
+            <w:r>
+              <w:drawing>
+                <wp:inline distT="0" distB="0" distL="0" distR="0">
+                  <wp:extent cx="1428750" cy="3095625"/>
+                  <wp:effectExtent t="19050" r="19050" b="19050" l="19050"/>
+                  <wp:docPr id="1" name="" descr="" title=""/>
+                  <wp:cNvGraphicFramePr>
+                    <a:graphicFrameLocks xmlns:a="http://schemas.openxmlformats.org/drawingml/2006/main" noChangeAspect="1"/>
+                  </wp:cNvGraphicFramePr>
+                  <a:graphic xmlns:a="http://schemas.openxmlformats.org/drawingml/2006/main">
+                    <a:graphicData uri="http://schemas.openxmlformats.org/drawingml/2006/picture">
+                      <pic:pic xmlns:pic="http://schemas.openxmlformats.org/drawingml/2006/picture">
+                        <pic:nvPicPr>
+                          <pic:cNvPr id="0" name="" descr=""/>
+                          <pic:cNvPicPr>
+                            <a:picLocks noChangeAspect="1" noChangeArrowheads="1"/>
+                          </pic:cNvPicPr>
+                        </pic:nvPicPr>
+                        <pic:blipFill>
+                          <a:blip r:embed="rId13" cstate="none"/>
+                          <a:srcRect/>
+                          <a:stretch>
+                            <a:fillRect/>
+                          </a:stretch>
+                        </pic:blipFill>
+                        <pic:spPr bwMode="auto">
+                          <a:xfrm>
+                            <a:off x="0" y="0"/>
+                            <a:ext cx="1428750" cy="3095625"/>
+                          </a:xfrm>
+                          <a:prstGeom prst="rect">
+                            <a:avLst/>
+                          </a:prstGeom>
+                          <a:noFill/>
+                          <a:ln>
+                            <a:solidFill>
+                              <a:srgbClr val="E2DED7"/>
+                            </a:solidFill>
+                          </a:ln>
+                        </pic:spPr>
+                      </pic:pic>
+                    </a:graphicData>
+                  </a:graphic>
+                </wp:inline>
+              </w:drawing>
+            </w:r>
+          </w:p>
+          <w:p>
+            <w:pPr>
+              <w:spacing w:after="200" w:before="60" w:line="260"/>
+              <w:jc w:val="center"/>
+            </w:pPr>
+            <w:r>
+              <w:rPr>
+                <w:rFonts w:ascii="Archivo ExtraBold" w:cs="Archivo ExtraBold" w:eastAsia="Archivo ExtraBold" w:hAnsi="Archivo ExtraBold"/>
+                <w:color w:val="141311"/>
+                <w:spacing w:val="20"/>
+                <w:sz w:val="15"/>
+                <w:szCs w:val="15"/>
+              </w:rPr>
+              <w:t xml:space="preserve">FIGURA 2. </w:t>
+            </w:r>
+            <w:r>
+              <w:rPr>
+                <w:rFonts w:ascii="Archivo" w:cs="Archivo" w:eastAsia="Archivo" w:hAnsi="Archivo"/>
+                <w:color w:val="6F6A62"/>
+                <w:sz w:val="17"/>
+                <w:szCs w:val="17"/>
+              </w:rPr>
+              <w:t xml:space="preserve">Inicio de sesión con usuario y contraseña.</w:t>
+            </w:r>
+          </w:p>
+        </w:tc>
+        <w:tc>
+          <w:tcPr>
+            <w:tcW w:type="dxa" w:w="3120"/>
+            <w:tcBorders>
+              <w:top w:val="none" w:color="FFFFFF" w:sz="0"/>
+              <w:left w:val="none" w:color="FFFFFF" w:sz="0"/>
+              <w:bottom w:val="none" w:color="FFFFFF" w:sz="0"/>
+              <w:right w:val="none" w:color="FFFFFF" w:sz="0"/>
+            </w:tcBorders>
+            <w:tcMar>
+              <w:top w:type="dxa" w:w="60"/>
+              <w:left w:type="dxa" w:w="80"/>
+              <w:bottom w:type="dxa" w:w="60"/>
+              <w:right w:type="dxa" w:w="80"/>
+            </w:tcMar>
+          </w:tcPr>
+          <w:p>
+            <w:pPr>
+              <w:jc w:val="center"/>
+            </w:pPr>
+            <w:r>
+              <w:drawing>
+                <wp:inline distT="0" distB="0" distL="0" distR="0">
+                  <wp:extent cx="1428750" cy="3095625"/>
+                  <wp:effectExtent t="19050" r="19050" b="19050" l="19050"/>
+                  <wp:docPr id="1" name="" descr="" title=""/>
+                  <wp:cNvGraphicFramePr>
+                    <a:graphicFrameLocks xmlns:a="http://schemas.openxmlformats.org/drawingml/2006/main" noChangeAspect="1"/>
+                  </wp:cNvGraphicFramePr>
+                  <a:graphic xmlns:a="http://schemas.openxmlformats.org/drawingml/2006/main">
+                    <a:graphicData uri="http://schemas.openxmlformats.org/drawingml/2006/picture">
+                      <pic:pic xmlns:pic="http://schemas.openxmlformats.org/drawingml/2006/picture">
+                        <pic:nvPicPr>
+                          <pic:cNvPr id="0" name="" descr=""/>
+                          <pic:cNvPicPr>
+                            <a:picLocks noChangeAspect="1" noChangeArrowheads="1"/>
+                          </pic:cNvPicPr>
+                        </pic:nvPicPr>
+                        <pic:blipFill>
+                          <a:blip r:embed="rId14" cstate="none"/>
+                          <a:srcRect/>
+                          <a:stretch>
+                            <a:fillRect/>
+                          </a:stretch>
+                        </pic:blipFill>
+                        <pic:spPr bwMode="auto">
+                          <a:xfrm>
+                            <a:off x="0" y="0"/>
+                            <a:ext cx="1428750" cy="3095625"/>
+                          </a:xfrm>
+                          <a:prstGeom prst="rect">
+                            <a:avLst/>
+                          </a:prstGeom>
+                          <a:noFill/>
+                          <a:ln>
+                            <a:solidFill>
+                              <a:srgbClr val="E2DED7"/>
+                            </a:solidFill>
+                          </a:ln>
+                        </pic:spPr>
+                      </pic:pic>
+                    </a:graphicData>
+                  </a:graphic>
+                </wp:inline>
+              </w:drawing>
+            </w:r>
+          </w:p>
+          <w:p>
+            <w:pPr>
+              <w:spacing w:after="200" w:before="60" w:line="260"/>
+              <w:jc w:val="center"/>
+            </w:pPr>
+            <w:r>
+              <w:rPr>
+                <w:rFonts w:ascii="Archivo ExtraBold" w:cs="Archivo ExtraBold" w:eastAsia="Archivo ExtraBold" w:hAnsi="Archivo ExtraBold"/>
+                <w:color w:val="141311"/>
+                <w:spacing w:val="20"/>
+                <w:sz w:val="15"/>
+                <w:szCs w:val="15"/>
+              </w:rPr>
+              <w:t xml:space="preserve">FIGURA 3. </w:t>
+            </w:r>
+            <w:r>
+              <w:rPr>
+                <w:rFonts w:ascii="Archivo" w:cs="Archivo" w:eastAsia="Archivo" w:hAnsi="Archivo"/>
+                <w:color w:val="6F6A62"/>
+                <w:sz w:val="17"/>
+                <w:szCs w:val="17"/>
+              </w:rPr>
+              <w:t xml:space="preserve">Inicio del caporal: sus cuatro tareas del día.</w:t>
+            </w:r>
+          </w:p>
+        </w:tc>
+      </w:tr>
+      <w:tr>
+        <w:trPr>
+          <w:cantSplit/>
+        </w:trPr>
+        <w:tc>
+          <w:tcPr>
+            <w:tcW w:type="dxa" w:w="3120"/>
+            <w:tcBorders>
+              <w:top w:val="none" w:color="FFFFFF" w:sz="0"/>
+              <w:left w:val="none" w:color="FFFFFF" w:sz="0"/>
+              <w:bottom w:val="none" w:color="FFFFFF" w:sz="0"/>
+              <w:right w:val="none" w:color="FFFFFF" w:sz="0"/>
+            </w:tcBorders>
+            <w:tcMar>
+              <w:top w:type="dxa" w:w="60"/>
+              <w:left w:type="dxa" w:w="80"/>
+              <w:bottom w:type="dxa" w:w="60"/>
+              <w:right w:type="dxa" w:w="80"/>
+            </w:tcMar>
+          </w:tcPr>
+          <w:p>
+            <w:pPr>
+              <w:jc w:val="center"/>
+            </w:pPr>
+            <w:r>
+              <w:drawing>
+                <wp:inline distT="0" distB="0" distL="0" distR="0">
+                  <wp:extent cx="1428750" cy="3095625"/>
+                  <wp:effectExtent t="19050" r="19050" b="19050" l="19050"/>
+                  <wp:docPr id="1" name="" descr="" title=""/>
+                  <wp:cNvGraphicFramePr>
+                    <a:graphicFrameLocks xmlns:a="http://schemas.openxmlformats.org/drawingml/2006/main" noChangeAspect="1"/>
+                  </wp:cNvGraphicFramePr>
+                  <a:graphic xmlns:a="http://schemas.openxmlformats.org/drawingml/2006/main">
+                    <a:graphicData uri="http://schemas.openxmlformats.org/drawingml/2006/picture">
+                      <pic:pic xmlns:pic="http://schemas.openxmlformats.org/drawingml/2006/picture">
+                        <pic:nvPicPr>
+                          <pic:cNvPr id="0" name="" descr=""/>
+                          <pic:cNvPicPr>
+                            <a:picLocks noChangeAspect="1" noChangeArrowheads="1"/>
+                          </pic:cNvPicPr>
+                        </pic:nvPicPr>
+                        <pic:blipFill>
+                          <a:blip r:embed="rId15" cstate="none"/>
+                          <a:srcRect/>
+                          <a:stretch>
+                            <a:fillRect/>
+                          </a:stretch>
+                        </pic:blipFill>
+                        <pic:spPr bwMode="auto">
+                          <a:xfrm>
+                            <a:off x="0" y="0"/>
+                            <a:ext cx="1428750" cy="3095625"/>
+                          </a:xfrm>
+                          <a:prstGeom prst="rect">
+                            <a:avLst/>
+                          </a:prstGeom>
+                          <a:noFill/>
+                          <a:ln>
+                            <a:solidFill>
+                              <a:srgbClr val="E2DED7"/>
+                            </a:solidFill>
+                          </a:ln>
+                        </pic:spPr>
+                      </pic:pic>
+                    </a:graphicData>
+                  </a:graphic>
+                </wp:inline>
+              </w:drawing>
+            </w:r>
+          </w:p>
+          <w:p>
+            <w:pPr>
+              <w:spacing w:after="200" w:before="60" w:line="260"/>
+              <w:jc w:val="center"/>
+            </w:pPr>
+            <w:r>
+              <w:rPr>
+                <w:rFonts w:ascii="Archivo ExtraBold" w:cs="Archivo ExtraBold" w:eastAsia="Archivo ExtraBold" w:hAnsi="Archivo ExtraBold"/>
+                <w:color w:val="141311"/>
+                <w:spacing w:val="20"/>
+                <w:sz w:val="15"/>
+                <w:szCs w:val="15"/>
+              </w:rPr>
+              <w:t xml:space="preserve">FIGURA 4. </w:t>
+            </w:r>
+            <w:r>
+              <w:rPr>
+                <w:rFonts w:ascii="Archivo" w:cs="Archivo" w:eastAsia="Archivo" w:hAnsi="Archivo"/>
+                <w:color w:val="6F6A62"/>
+                <w:sz w:val="17"/>
+                <w:szCs w:val="17"/>
+              </w:rPr>
+              <w:t xml:space="preserve">Asistencia: motivo cuando el trabajador no llegó.</w:t>
+            </w:r>
+          </w:p>
+        </w:tc>
+        <w:tc>
+          <w:tcPr>
+            <w:tcW w:type="dxa" w:w="3120"/>
+            <w:tcBorders>
+              <w:top w:val="none" w:color="FFFFFF" w:sz="0"/>
+              <w:left w:val="none" w:color="FFFFFF" w:sz="0"/>
+              <w:bottom w:val="none" w:color="FFFFFF" w:sz="0"/>
+              <w:right w:val="none" w:color="FFFFFF" w:sz="0"/>
+            </w:tcBorders>
+            <w:tcMar>
+              <w:top w:type="dxa" w:w="60"/>
+              <w:left w:type="dxa" w:w="80"/>
+              <w:bottom w:type="dxa" w:w="60"/>
+              <w:right w:type="dxa" w:w="80"/>
+            </w:tcMar>
+          </w:tcPr>
+          <w:p>
+            <w:pPr>
+              <w:jc w:val="center"/>
+            </w:pPr>
+            <w:r>
+              <w:drawing>
+                <wp:inline distT="0" distB="0" distL="0" distR="0">
+                  <wp:extent cx="1428750" cy="3095625"/>
+                  <wp:effectExtent t="19050" r="19050" b="19050" l="19050"/>
+                  <wp:docPr id="1" name="" descr="" title=""/>
+                  <wp:cNvGraphicFramePr>
+                    <a:graphicFrameLocks xmlns:a="http://schemas.openxmlformats.org/drawingml/2006/main" noChangeAspect="1"/>
+                  </wp:cNvGraphicFramePr>
+                  <a:graphic xmlns:a="http://schemas.openxmlformats.org/drawingml/2006/main">
+                    <a:graphicData uri="http://schemas.openxmlformats.org/drawingml/2006/picture">
+                      <pic:pic xmlns:pic="http://schemas.openxmlformats.org/drawingml/2006/picture">
+                        <pic:nvPicPr>
+                          <pic:cNvPr id="0" name="" descr=""/>
+                          <pic:cNvPicPr>
+                            <a:picLocks noChangeAspect="1" noChangeArrowheads="1"/>
+                          </pic:cNvPicPr>
+                        </pic:nvPicPr>
+                        <pic:blipFill>
+                          <a:blip r:embed="rId16" cstate="none"/>
+                          <a:srcRect/>
+                          <a:stretch>
+                            <a:fillRect/>
+                          </a:stretch>
+                        </pic:blipFill>
+                        <pic:spPr bwMode="auto">
+                          <a:xfrm>
+                            <a:off x="0" y="0"/>
+                            <a:ext cx="1428750" cy="3095625"/>
+                          </a:xfrm>
+                          <a:prstGeom prst="rect">
+                            <a:avLst/>
+                          </a:prstGeom>
+                          <a:noFill/>
+                          <a:ln>
+                            <a:solidFill>
+                              <a:srgbClr val="E2DED7"/>
+                            </a:solidFill>
+                          </a:ln>
+                        </pic:spPr>
+                      </pic:pic>
+                    </a:graphicData>
+                  </a:graphic>
+                </wp:inline>
+              </w:drawing>
+            </w:r>
+          </w:p>
+          <w:p>
+            <w:pPr>
+              <w:spacing w:after="200" w:before="60" w:line="260"/>
+              <w:jc w:val="center"/>
+            </w:pPr>
+            <w:r>
+              <w:rPr>
+                <w:rFonts w:ascii="Archivo ExtraBold" w:cs="Archivo ExtraBold" w:eastAsia="Archivo ExtraBold" w:hAnsi="Archivo ExtraBold"/>
+                <w:color w:val="141311"/>
+                <w:spacing w:val="20"/>
+                <w:sz w:val="15"/>
+                <w:szCs w:val="15"/>
+              </w:rPr>
+              <w:t xml:space="preserve">FIGURA 5. </w:t>
+            </w:r>
+            <w:r>
+              <w:rPr>
+                <w:rFonts w:ascii="Archivo" w:cs="Archivo" w:eastAsia="Archivo" w:hAnsi="Archivo"/>
+                <w:color w:val="6F6A62"/>
+                <w:sz w:val="17"/>
+                <w:szCs w:val="17"/>
+              </w:rPr>
+              <w:t xml:space="preserve">Asignación: reparto del personal por labor.</w:t>
+            </w:r>
+          </w:p>
+        </w:tc>
+        <w:tc>
+          <w:tcPr>
+            <w:tcW w:type="dxa" w:w="3120"/>
+            <w:tcBorders>
+              <w:top w:val="none" w:color="FFFFFF" w:sz="0"/>
+              <w:left w:val="none" w:color="FFFFFF" w:sz="0"/>
+              <w:bottom w:val="none" w:color="FFFFFF" w:sz="0"/>
+              <w:right w:val="none" w:color="FFFFFF" w:sz="0"/>
+            </w:tcBorders>
+            <w:tcMar>
+              <w:top w:type="dxa" w:w="60"/>
+              <w:left w:type="dxa" w:w="80"/>
+              <w:bottom w:type="dxa" w:w="60"/>
+              <w:right w:type="dxa" w:w="80"/>
+            </w:tcMar>
+          </w:tcPr>
+          <w:p>
+            <w:pPr>
+              <w:jc w:val="center"/>
+            </w:pPr>
+            <w:r>
+              <w:drawing>
+                <wp:inline distT="0" distB="0" distL="0" distR="0">
+                  <wp:extent cx="1428750" cy="3095625"/>
+                  <wp:effectExtent t="19050" r="19050" b="19050" l="19050"/>
+                  <wp:docPr id="1" name="" descr="" title=""/>
+                  <wp:cNvGraphicFramePr>
+                    <a:graphicFrameLocks xmlns:a="http://schemas.openxmlformats.org/drawingml/2006/main" noChangeAspect="1"/>
+                  </wp:cNvGraphicFramePr>
+                  <a:graphic xmlns:a="http://schemas.openxmlformats.org/drawingml/2006/main">
+                    <a:graphicData uri="http://schemas.openxmlformats.org/drawingml/2006/picture">
+                      <pic:pic xmlns:pic="http://schemas.openxmlformats.org/drawingml/2006/picture">
+                        <pic:nvPicPr>
+                          <pic:cNvPr id="0" name="" descr=""/>
+                          <pic:cNvPicPr>
+                            <a:picLocks noChangeAspect="1" noChangeArrowheads="1"/>
+                          </pic:cNvPicPr>
+                        </pic:nvPicPr>
+                        <pic:blipFill>
+                          <a:blip r:embed="rId17" cstate="none"/>
+                          <a:srcRect/>
+                          <a:stretch>
+                            <a:fillRect/>
+                          </a:stretch>
+                        </pic:blipFill>
+                        <pic:spPr bwMode="auto">
+                          <a:xfrm>
+                            <a:off x="0" y="0"/>
+                            <a:ext cx="1428750" cy="3095625"/>
+                          </a:xfrm>
+                          <a:prstGeom prst="rect">
+                            <a:avLst/>
+                          </a:prstGeom>
+                          <a:noFill/>
+                          <a:ln>
+                            <a:solidFill>
+                              <a:srgbClr val="E2DED7"/>
+                            </a:solidFill>
+                          </a:ln>
+                        </pic:spPr>
+                      </pic:pic>
+                    </a:graphicData>
+                  </a:graphic>
+                </wp:inline>
+              </w:drawing>
+            </w:r>
+          </w:p>
+          <w:p>
+            <w:pPr>
+              <w:spacing w:after="200" w:before="60" w:line="260"/>
+              <w:jc w:val="center"/>
+            </w:pPr>
+            <w:r>
+              <w:rPr>
+                <w:rFonts w:ascii="Archivo ExtraBold" w:cs="Archivo ExtraBold" w:eastAsia="Archivo ExtraBold" w:hAnsi="Archivo ExtraBold"/>
+                <w:color w:val="141311"/>
+                <w:spacing w:val="20"/>
+                <w:sz w:val="15"/>
+                <w:szCs w:val="15"/>
+              </w:rPr>
+              <w:t xml:space="preserve">FIGURA 6. </w:t>
+            </w:r>
+            <w:r>
+              <w:rPr>
+                <w:rFonts w:ascii="Archivo" w:cs="Archivo" w:eastAsia="Archivo" w:hAnsi="Archivo"/>
+                <w:color w:val="6F6A62"/>
+                <w:sz w:val="17"/>
+                <w:szCs w:val="17"/>
+              </w:rPr>
+              <w:t xml:space="preserve">Botón ENVIAR: confirmación antes de enviar.</w:t>
+            </w:r>
+          </w:p>
+        </w:tc>
+      </w:tr>
+    </w:tbl>
+    <w:p>
+      <w:pPr>
+        <w:keepNext/>
+        <w:spacing w:after="80" w:before="200"/>
+      </w:pPr>
+      <w:r>
+        <w:rPr>
+          <w:rFonts w:ascii="Archivo SemiBold" w:cs="Archivo SemiBold" w:eastAsia="Archivo SemiBold" w:hAnsi="Archivo SemiBold"/>
+          <w:color w:val="141311"/>
+          <w:sz w:val="22"/>
+          <w:szCs w:val="22"/>
+        </w:rPr>
+        <w:t xml:space="preserve">Gerencia, plagas y supervisión</w:t>
+      </w:r>
+    </w:p>
+    <w:tbl>
+      <w:tblPr>
+        <w:tblW w:type="dxa" w:w="9360"/>
+        <w:tblBorders>
+          <w:top w:val="single" w:color="auto" w:sz="4"/>
+          <w:left w:val="single" w:color="auto" w:sz="4"/>
+          <w:bottom w:val="single" w:color="auto" w:sz="4"/>
+          <w:right w:val="single" w:color="auto" w:sz="4"/>
+          <w:insideH w:val="single" w:color="auto" w:sz="4"/>
+          <w:insideV w:val="single" w:color="auto" w:sz="4"/>
+        </w:tblBorders>
+      </w:tblPr>
+      <w:tblGrid>
+        <w:gridCol w:w="3120"/>
+        <w:gridCol w:w="3120"/>
+        <w:gridCol w:w="3120"/>
+      </w:tblGrid>
+      <w:tr>
+        <w:trPr>
+          <w:cantSplit/>
+        </w:trPr>
+        <w:tc>
+          <w:tcPr>
+            <w:tcW w:type="dxa" w:w="3120"/>
+            <w:tcBorders>
+              <w:top w:val="none" w:color="FFFFFF" w:sz="0"/>
+              <w:left w:val="none" w:color="FFFFFF" w:sz="0"/>
+              <w:bottom w:val="none" w:color="FFFFFF" w:sz="0"/>
+              <w:right w:val="none" w:color="FFFFFF" w:sz="0"/>
+            </w:tcBorders>
+            <w:tcMar>
+              <w:top w:type="dxa" w:w="60"/>
+              <w:left w:type="dxa" w:w="80"/>
+              <w:bottom w:type="dxa" w:w="60"/>
+              <w:right w:type="dxa" w:w="80"/>
+            </w:tcMar>
+          </w:tcPr>
+          <w:p>
+            <w:pPr>
+              <w:jc w:val="center"/>
+            </w:pPr>
+            <w:r>
+              <w:drawing>
+                <wp:inline distT="0" distB="0" distL="0" distR="0">
+                  <wp:extent cx="1428750" cy="3095625"/>
+                  <wp:effectExtent t="19050" r="19050" b="19050" l="19050"/>
+                  <wp:docPr id="1" name="" descr="" title=""/>
+                  <wp:cNvGraphicFramePr>
+                    <a:graphicFrameLocks xmlns:a="http://schemas.openxmlformats.org/drawingml/2006/main" noChangeAspect="1"/>
+                  </wp:cNvGraphicFramePr>
+                  <a:graphic xmlns:a="http://schemas.openxmlformats.org/drawingml/2006/main">
+                    <a:graphicData uri="http://schemas.openxmlformats.org/drawingml/2006/picture">
+                      <pic:pic xmlns:pic="http://schemas.openxmlformats.org/drawingml/2006/picture">
+                        <pic:nvPicPr>
+                          <pic:cNvPr id="0" name="" descr=""/>
+                          <pic:cNvPicPr>
+                            <a:picLocks noChangeAspect="1" noChangeArrowheads="1"/>
+                          </pic:cNvPicPr>
+                        </pic:nvPicPr>
+                        <pic:blipFill>
+                          <a:blip r:embed="rId18" cstate="none"/>
+                          <a:srcRect/>
+                          <a:stretch>
+                            <a:fillRect/>
+                          </a:stretch>
+                        </pic:blipFill>
+                        <pic:spPr bwMode="auto">
+                          <a:xfrm>
+                            <a:off x="0" y="0"/>
+                            <a:ext cx="1428750" cy="3095625"/>
+                          </a:xfrm>
+                          <a:prstGeom prst="rect">
+                            <a:avLst/>
+                          </a:prstGeom>
+                          <a:noFill/>
+                          <a:ln>
+                            <a:solidFill>
+                              <a:srgbClr val="E2DED7"/>
+                            </a:solidFill>
+                          </a:ln>
+                        </pic:spPr>
+                      </pic:pic>
+                    </a:graphicData>
+                  </a:graphic>
+                </wp:inline>
+              </w:drawing>
+            </w:r>
+          </w:p>
+          <w:p>
+            <w:pPr>
+              <w:spacing w:after="200" w:before="60" w:line="260"/>
+              <w:jc w:val="center"/>
+            </w:pPr>
+            <w:r>
+              <w:rPr>
+                <w:rFonts w:ascii="Archivo ExtraBold" w:cs="Archivo ExtraBold" w:eastAsia="Archivo ExtraBold" w:hAnsi="Archivo ExtraBold"/>
+                <w:color w:val="141311"/>
+                <w:spacing w:val="20"/>
+                <w:sz w:val="15"/>
+                <w:szCs w:val="15"/>
+              </w:rPr>
+              <w:t xml:space="preserve">FIGURA 7. </w:t>
+            </w:r>
+            <w:r>
+              <w:rPr>
+                <w:rFonts w:ascii="Archivo" w:cs="Archivo" w:eastAsia="Archivo" w:hAnsi="Archivo"/>
+                <w:color w:val="6F6A62"/>
+                <w:sz w:val="17"/>
+                <w:szCs w:val="17"/>
+              </w:rPr>
+              <w:t xml:space="preserve">Gerencia: indicadores de la semana.</w:t>
+            </w:r>
+          </w:p>
+        </w:tc>
+        <w:tc>
+          <w:tcPr>
+            <w:tcW w:type="dxa" w:w="3120"/>
+            <w:tcBorders>
+              <w:top w:val="none" w:color="FFFFFF" w:sz="0"/>
+              <w:left w:val="none" w:color="FFFFFF" w:sz="0"/>
+              <w:bottom w:val="none" w:color="FFFFFF" w:sz="0"/>
+              <w:right w:val="none" w:color="FFFFFF" w:sz="0"/>
+            </w:tcBorders>
+            <w:tcMar>
+              <w:top w:type="dxa" w:w="60"/>
+              <w:left w:type="dxa" w:w="80"/>
+              <w:bottom w:type="dxa" w:w="60"/>
+              <w:right w:type="dxa" w:w="80"/>
+            </w:tcMar>
+          </w:tcPr>
+          <w:p>
+            <w:pPr>
+              <w:jc w:val="center"/>
+            </w:pPr>
+            <w:r>
+              <w:drawing>
+                <wp:inline distT="0" distB="0" distL="0" distR="0">
+                  <wp:extent cx="1428750" cy="3095625"/>
+                  <wp:effectExtent t="19050" r="19050" b="19050" l="19050"/>
+                  <wp:docPr id="1" name="" descr="" title=""/>
+                  <wp:cNvGraphicFramePr>
+                    <a:graphicFrameLocks xmlns:a="http://schemas.openxmlformats.org/drawingml/2006/main" noChangeAspect="1"/>
+                  </wp:cNvGraphicFramePr>
+                  <a:graphic xmlns:a="http://schemas.openxmlformats.org/drawingml/2006/main">
+                    <a:graphicData uri="http://schemas.openxmlformats.org/drawingml/2006/picture">
+                      <pic:pic xmlns:pic="http://schemas.openxmlformats.org/drawingml/2006/picture">
+                        <pic:nvPicPr>
+                          <pic:cNvPr id="0" name="" descr=""/>
+                          <pic:cNvPicPr>
+                            <a:picLocks noChangeAspect="1" noChangeArrowheads="1"/>
+                          </pic:cNvPicPr>
+                        </pic:nvPicPr>
+                        <pic:blipFill>
+                          <a:blip r:embed="rId19" cstate="none"/>
+                          <a:srcRect/>
+                          <a:stretch>
+                            <a:fillRect/>
+                          </a:stretch>
+                        </pic:blipFill>
+                        <pic:spPr bwMode="auto">
+                          <a:xfrm>
+                            <a:off x="0" y="0"/>
+                            <a:ext cx="1428750" cy="3095625"/>
+                          </a:xfrm>
+                          <a:prstGeom prst="rect">
+                            <a:avLst/>
+                          </a:prstGeom>
+                          <a:noFill/>
+                          <a:ln>
+                            <a:solidFill>
+                              <a:srgbClr val="E2DED7"/>
+                            </a:solidFill>
+                          </a:ln>
+                        </pic:spPr>
+                      </pic:pic>
+                    </a:graphicData>
+                  </a:graphic>
+                </wp:inline>
+              </w:drawing>
+            </w:r>
+          </w:p>
+          <w:p>
+            <w:pPr>
+              <w:spacing w:after="200" w:before="60" w:line="260"/>
+              <w:jc w:val="center"/>
+            </w:pPr>
+            <w:r>
+              <w:rPr>
+                <w:rFonts w:ascii="Archivo ExtraBold" w:cs="Archivo ExtraBold" w:eastAsia="Archivo ExtraBold" w:hAnsi="Archivo ExtraBold"/>
+                <w:color w:val="141311"/>
+                <w:spacing w:val="20"/>
+                <w:sz w:val="15"/>
+                <w:szCs w:val="15"/>
+              </w:rPr>
+              <w:t xml:space="preserve">FIGURA 8. </w:t>
+            </w:r>
+            <w:r>
+              <w:rPr>
+                <w:rFonts w:ascii="Archivo" w:cs="Archivo" w:eastAsia="Archivo" w:hAnsi="Archivo"/>
+                <w:color w:val="6F6A62"/>
+                <w:sz w:val="17"/>
+                <w:szCs w:val="17"/>
+              </w:rPr>
+              <w:t xml:space="preserve">Gerencia: gráficas de producción y personal.</w:t>
+            </w:r>
+          </w:p>
+        </w:tc>
+        <w:tc>
+          <w:tcPr>
+            <w:tcW w:type="dxa" w:w="3120"/>
+            <w:tcBorders>
+              <w:top w:val="none" w:color="FFFFFF" w:sz="0"/>
+              <w:left w:val="none" w:color="FFFFFF" w:sz="0"/>
+              <w:bottom w:val="none" w:color="FFFFFF" w:sz="0"/>
+              <w:right w:val="none" w:color="FFFFFF" w:sz="0"/>
+            </w:tcBorders>
+            <w:tcMar>
+              <w:top w:type="dxa" w:w="60"/>
+              <w:left w:type="dxa" w:w="80"/>
+              <w:bottom w:type="dxa" w:w="60"/>
+              <w:right w:type="dxa" w:w="80"/>
+            </w:tcMar>
+          </w:tcPr>
+          <w:p>
+            <w:pPr>
+              <w:jc w:val="center"/>
+            </w:pPr>
+            <w:r>
+              <w:drawing>
+                <wp:inline distT="0" distB="0" distL="0" distR="0">
+                  <wp:extent cx="1428750" cy="3095625"/>
+                  <wp:effectExtent t="19050" r="19050" b="19050" l="19050"/>
+                  <wp:docPr id="1" name="" descr="" title=""/>
+                  <wp:cNvGraphicFramePr>
+                    <a:graphicFrameLocks xmlns:a="http://schemas.openxmlformats.org/drawingml/2006/main" noChangeAspect="1"/>
+                  </wp:cNvGraphicFramePr>
+                  <a:graphic xmlns:a="http://schemas.openxmlformats.org/drawingml/2006/main">
+                    <a:graphicData uri="http://schemas.openxmlformats.org/drawingml/2006/picture">
+                      <pic:pic xmlns:pic="http://schemas.openxmlformats.org/drawingml/2006/picture">
+                        <pic:nvPicPr>
+                          <pic:cNvPr id="0" name="" descr=""/>
+                          <pic:cNvPicPr>
+                            <a:picLocks noChangeAspect="1" noChangeArrowheads="1"/>
+                          </pic:cNvPicPr>
+                        </pic:nvPicPr>
+                        <pic:blipFill>
+                          <a:blip r:embed="rId20" cstate="none"/>
+                          <a:srcRect/>
+                          <a:stretch>
+                            <a:fillRect/>
+                          </a:stretch>
+                        </pic:blipFill>
+                        <pic:spPr bwMode="auto">
+                          <a:xfrm>
+                            <a:off x="0" y="0"/>
+                            <a:ext cx="1428750" cy="3095625"/>
+                          </a:xfrm>
+                          <a:prstGeom prst="rect">
+                            <a:avLst/>
+                          </a:prstGeom>
+                          <a:noFill/>
+                          <a:ln>
+                            <a:solidFill>
+                              <a:srgbClr val="E2DED7"/>
+                            </a:solidFill>
+                          </a:ln>
+                        </pic:spPr>
+                      </pic:pic>
+                    </a:graphicData>
+                  </a:graphic>
+                </wp:inline>
+              </w:drawing>
+            </w:r>
+          </w:p>
+          <w:p>
+            <w:pPr>
+              <w:spacing w:after="200" w:before="60" w:line="260"/>
+              <w:jc w:val="center"/>
+            </w:pPr>
+            <w:r>
+              <w:rPr>
+                <w:rFonts w:ascii="Archivo ExtraBold" w:cs="Archivo ExtraBold" w:eastAsia="Archivo ExtraBold" w:hAnsi="Archivo ExtraBold"/>
+                <w:color w:val="141311"/>
+                <w:spacing w:val="20"/>
+                <w:sz w:val="15"/>
+                <w:szCs w:val="15"/>
+              </w:rPr>
+              <w:t xml:space="preserve">FIGURA 9. </w:t>
+            </w:r>
+            <w:r>
+              <w:rPr>
+                <w:rFonts w:ascii="Archivo" w:cs="Archivo" w:eastAsia="Archivo" w:hAnsi="Archivo"/>
+                <w:color w:val="6F6A62"/>
+                <w:sz w:val="17"/>
+                <w:szCs w:val="17"/>
+              </w:rPr>
+              <w:t xml:space="preserve">Técnico de plagas: tareas y avance por lote.</w:t>
+            </w:r>
+          </w:p>
+        </w:tc>
+      </w:tr>
+      <w:tr>
+        <w:trPr>
+          <w:cantSplit/>
+        </w:trPr>
+        <w:tc>
+          <w:tcPr>
+            <w:tcW w:type="dxa" w:w="3120"/>
+            <w:tcBorders>
+              <w:top w:val="none" w:color="FFFFFF" w:sz="0"/>
+              <w:left w:val="none" w:color="FFFFFF" w:sz="0"/>
+              <w:bottom w:val="none" w:color="FFFFFF" w:sz="0"/>
+              <w:right w:val="none" w:color="FFFFFF" w:sz="0"/>
+            </w:tcBorders>
+            <w:tcMar>
+              <w:top w:type="dxa" w:w="60"/>
+              <w:left w:type="dxa" w:w="80"/>
+              <w:bottom w:type="dxa" w:w="60"/>
+              <w:right w:type="dxa" w:w="80"/>
+            </w:tcMar>
+          </w:tcPr>
+          <w:p>
+            <w:pPr>
+              <w:jc w:val="center"/>
+            </w:pPr>
+            <w:r>
+              <w:drawing>
+                <wp:inline distT="0" distB="0" distL="0" distR="0">
+                  <wp:extent cx="1428750" cy="3095625"/>
+                  <wp:effectExtent t="19050" r="19050" b="19050" l="19050"/>
+                  <wp:docPr id="1" name="" descr="" title=""/>
+                  <wp:cNvGraphicFramePr>
+                    <a:graphicFrameLocks xmlns:a="http://schemas.openxmlformats.org/drawingml/2006/main" noChangeAspect="1"/>
+                  </wp:cNvGraphicFramePr>
+                  <a:graphic xmlns:a="http://schemas.openxmlformats.org/drawingml/2006/main">
+                    <a:graphicData uri="http://schemas.openxmlformats.org/drawingml/2006/picture">
+                      <pic:pic xmlns:pic="http://schemas.openxmlformats.org/drawingml/2006/picture">
+                        <pic:nvPicPr>
+                          <pic:cNvPr id="0" name="" descr=""/>
+                          <pic:cNvPicPr>
+                            <a:picLocks noChangeAspect="1" noChangeArrowheads="1"/>
+                          </pic:cNvPicPr>
+                        </pic:nvPicPr>
+                        <pic:blipFill>
+                          <a:blip r:embed="rId21" cstate="none"/>
+                          <a:srcRect/>
+                          <a:stretch>
+                            <a:fillRect/>
+                          </a:stretch>
+                        </pic:blipFill>
+                        <pic:spPr bwMode="auto">
+                          <a:xfrm>
+                            <a:off x="0" y="0"/>
+                            <a:ext cx="1428750" cy="3095625"/>
+                          </a:xfrm>
+                          <a:prstGeom prst="rect">
+                            <a:avLst/>
+                          </a:prstGeom>
+                          <a:noFill/>
+                          <a:ln>
+                            <a:solidFill>
+                              <a:srgbClr val="E2DED7"/>
+                            </a:solidFill>
+                          </a:ln>
+                        </pic:spPr>
+                      </pic:pic>
+                    </a:graphicData>
+                  </a:graphic>
+                </wp:inline>
+              </w:drawing>
+            </w:r>
+          </w:p>
+          <w:p>
+            <w:pPr>
+              <w:spacing w:after="200" w:before="60" w:line="260"/>
+              <w:jc w:val="center"/>
+            </w:pPr>
+            <w:r>
+              <w:rPr>
+                <w:rFonts w:ascii="Archivo ExtraBold" w:cs="Archivo ExtraBold" w:eastAsia="Archivo ExtraBold" w:hAnsi="Archivo ExtraBold"/>
+                <w:color w:val="141311"/>
+                <w:spacing w:val="20"/>
+                <w:sz w:val="15"/>
+                <w:szCs w:val="15"/>
+              </w:rPr>
+              <w:t xml:space="preserve">FIGURA 10. </w:t>
+            </w:r>
+            <w:r>
+              <w:rPr>
+                <w:rFonts w:ascii="Archivo" w:cs="Archivo" w:eastAsia="Archivo" w:hAnsi="Archivo"/>
+                <w:color w:val="6F6A62"/>
+                <w:sz w:val="17"/>
+                <w:szCs w:val="17"/>
+              </w:rPr>
+              <w:t xml:space="preserve">Supervisión: por validar, alertas y personal.</w:t>
+            </w:r>
+          </w:p>
+        </w:tc>
+        <w:tc>
+          <w:tcPr>
+            <w:tcW w:type="dxa" w:w="3120"/>
+            <w:tcBorders>
+              <w:top w:val="none" w:color="FFFFFF" w:sz="0"/>
+              <w:left w:val="none" w:color="FFFFFF" w:sz="0"/>
+              <w:bottom w:val="none" w:color="FFFFFF" w:sz="0"/>
+              <w:right w:val="none" w:color="FFFFFF" w:sz="0"/>
+            </w:tcBorders>
+            <w:tcMar>
+              <w:top w:type="dxa" w:w="60"/>
+              <w:left w:type="dxa" w:w="80"/>
+              <w:bottom w:type="dxa" w:w="60"/>
+              <w:right w:type="dxa" w:w="80"/>
+            </w:tcMar>
+          </w:tcPr>
+          <w:p/>
+        </w:tc>
+        <w:tc>
+          <w:tcPr>
+            <w:tcW w:type="dxa" w:w="3120"/>
+            <w:tcBorders>
+              <w:top w:val="none" w:color="FFFFFF" w:sz="0"/>
+              <w:left w:val="none" w:color="FFFFFF" w:sz="0"/>
+              <w:bottom w:val="none" w:color="FFFFFF" w:sz="0"/>
+              <w:right w:val="none" w:color="FFFFFF" w:sz="0"/>
+            </w:tcBorders>
+            <w:tcMar>
+              <w:top w:type="dxa" w:w="60"/>
+              <w:left w:type="dxa" w:w="80"/>
+              <w:bottom w:type="dxa" w:w="60"/>
+              <w:right w:type="dxa" w:w="80"/>
+            </w:tcMar>
+          </w:tcPr>
+          <w:p/>
+        </w:tc>
+      </w:tr>
+    </w:tbl>
+    <w:p>
+      <w:r>
+        <w:br w:type="page"/>
+      </w:r>
+    </w:p>
+    <w:p>
+      <w:pPr>
+        <w:keepNext/>
+        <w:spacing w:after="80" w:before="200"/>
+      </w:pPr>
+      <w:r>
+        <w:rPr>
+          <w:rFonts w:ascii="Archivo SemiBold" w:cs="Archivo SemiBold" w:eastAsia="Archivo SemiBold" w:hAnsi="Archivo SemiBold"/>
+          <w:color w:val="141311"/>
+          <w:sz w:val="22"/>
+          <w:szCs w:val="22"/>
+        </w:rPr>
+        <w:t xml:space="preserve">Panel de oficina</w:t>
+      </w:r>
+    </w:p>
+    <w:p>
+      <w:pPr>
+        <w:jc w:val="center"/>
+      </w:pPr>
+      <w:r>
+        <w:drawing>
+          <wp:inline distT="0" distB="0" distL="0" distR="0">
+            <wp:extent cx="5715000" cy="4857750"/>
+            <wp:effectExtent t="19050" r="19050" b="19050" l="19050"/>
+            <wp:docPr id="1" name="" descr="" title=""/>
+            <wp:cNvGraphicFramePr>
+              <a:graphicFrameLocks xmlns:a="http://schemas.openxmlformats.org/drawingml/2006/main" noChangeAspect="1"/>
+            </wp:cNvGraphicFramePr>
+            <a:graphic xmlns:a="http://schemas.openxmlformats.org/drawingml/2006/main">
+              <a:graphicData uri="http://schemas.openxmlformats.org/drawingml/2006/picture">
+                <pic:pic xmlns:pic="http://schemas.openxmlformats.org/drawingml/2006/picture">
+                  <pic:nvPicPr>
+                    <pic:cNvPr id="0" name="" descr=""/>
+                    <pic:cNvPicPr>
+                      <a:picLocks noChangeAspect="1" noChangeArrowheads="1"/>
+                    </pic:cNvPicPr>
+                  </pic:nvPicPr>
+                  <pic:blipFill>
+                    <a:blip r:embed="rId22" cstate="none"/>
+                    <a:srcRect/>
+                    <a:stretch>
+                      <a:fillRect/>
+                    </a:stretch>
+                  </pic:blipFill>
+                  <pic:spPr bwMode="auto">
+                    <a:xfrm>
+                      <a:off x="0" y="0"/>
+                      <a:ext cx="5715000" cy="4857750"/>
+                    </a:xfrm>
+                    <a:prstGeom prst="rect">
+                      <a:avLst/>
+                    </a:prstGeom>
+                    <a:noFill/>
+                    <a:ln>
+                      <a:solidFill>
+                        <a:srgbClr val="E2DED7"/>
+                      </a:solidFill>
+                    </a:ln>
+                  </pic:spPr>
+                </pic:pic>
+              </a:graphicData>
+            </a:graphic>
+          </wp:inline>
+        </w:drawing>
+      </w:r>
+    </w:p>
+    <w:p>
+      <w:pPr>
+        <w:spacing w:after="200" w:before="60" w:line="260"/>
+        <w:jc w:val="center"/>
+      </w:pPr>
+      <w:r>
+        <w:rPr>
+          <w:rFonts w:ascii="Archivo ExtraBold" w:cs="Archivo ExtraBold" w:eastAsia="Archivo ExtraBold" w:hAnsi="Archivo ExtraBold"/>
+          <w:color w:val="141311"/>
+          <w:spacing w:val="20"/>
+          <w:sz w:val="15"/>
+          <w:szCs w:val="15"/>
+        </w:rPr>
+        <w:t xml:space="preserve">FIGURA 11. </w:t>
+      </w:r>
+      <w:r>
+        <w:rPr>
+          <w:rFonts w:ascii="Archivo" w:cs="Archivo" w:eastAsia="Archivo" w:hAnsi="Archivo"/>
+          <w:color w:val="6F6A62"/>
+          <w:sz w:val="17"/>
+          <w:szCs w:val="17"/>
+        </w:rPr>
+        <w:t xml:space="preserve">Panel de oficina: personal a cargo de cada caporal.</w:t>
       </w:r>
     </w:p>
     <w:p>

</xml_diff>